<commit_message>
Updated ai tools folderand meetings.md, also roadmap for sprint 2.
</commit_message>
<xml_diff>
--- a/doc/Roadmap for SEP.docx
+++ b/doc/Roadmap for SEP.docx
@@ -49,6 +49,11 @@
               <w:t>23 Jan</w:t>
             </w:r>
           </w:p>
+          <w:p>
+            <w:r>
+              <w:t>S1 Manager: Freddie</w:t>
+            </w:r>
+          </w:p>
         </w:tc>
         <w:tc>
           <w:tcPr>
@@ -57,6 +62,142 @@
           <w:p>
             <w:r>
               <w:t>Gamification feature possible ideas:</w:t>
+            </w:r>
+          </w:p>
+          <w:p>
+            <w:pPr>
+              <w:pStyle w:val="ListParagraph"/>
+              <w:numPr>
+                <w:ilvl w:val="0"/>
+                <w:numId w:val="2"/>
+              </w:numPr>
+              <w:rPr>
+                <w:color w:val="95DCF7" w:themeColor="accent4" w:themeTint="66"/>
+              </w:rPr>
+            </w:pPr>
+            <w:r>
+              <w:rPr>
+                <w:color w:val="95DCF7" w:themeColor="accent4" w:themeTint="66"/>
+              </w:rPr>
+              <w:t xml:space="preserve">Butterfly character at item listing page – click buy and flying around – not too invasive </w:t>
+            </w:r>
+          </w:p>
+          <w:p>
+            <w:pPr>
+              <w:pStyle w:val="ListParagraph"/>
+              <w:numPr>
+                <w:ilvl w:val="0"/>
+                <w:numId w:val="2"/>
+              </w:numPr>
+              <w:rPr>
+                <w:color w:val="95DCF7" w:themeColor="accent4" w:themeTint="66"/>
+              </w:rPr>
+            </w:pPr>
+            <w:r>
+              <w:rPr>
+                <w:color w:val="95DCF7" w:themeColor="accent4" w:themeTint="66"/>
+              </w:rPr>
+              <w:t xml:space="preserve">Log-in page interaction </w:t>
+            </w:r>
+          </w:p>
+          <w:p>
+            <w:pPr>
+              <w:pStyle w:val="ListParagraph"/>
+              <w:numPr>
+                <w:ilvl w:val="0"/>
+                <w:numId w:val="5"/>
+              </w:numPr>
+            </w:pPr>
+            <w:r>
+              <w:rPr>
+                <w:color w:val="95DCF7" w:themeColor="accent4" w:themeTint="66"/>
+              </w:rPr>
+              <w:t xml:space="preserve">Pop-up when something is achieved </w:t>
+            </w:r>
+          </w:p>
+        </w:tc>
+      </w:tr>
+      <w:tr>
+        <w:tc>
+          <w:tcPr>
+            <w:tcW w:w="1615" w:type="dxa"/>
+          </w:tcPr>
+          <w:p>
+            <w:r>
+              <w:t>Week 14</w:t>
+            </w:r>
+          </w:p>
+          <w:p>
+            <w:r>
+              <w:t>28 Jan</w:t>
+            </w:r>
+          </w:p>
+          <w:p>
+            <w:r>
+              <w:t xml:space="preserve">S1 </w:t>
+            </w:r>
+            <w:r>
+              <w:t>Manager: Freddie</w:t>
+            </w:r>
+          </w:p>
+        </w:tc>
+        <w:tc>
+          <w:tcPr>
+            <w:tcW w:w="7401" w:type="dxa"/>
+          </w:tcPr>
+          <w:p>
+            <w:r>
+              <w:t xml:space="preserve">MVP release &amp; testing day </w:t>
+            </w:r>
+          </w:p>
+          <w:p>
+            <w:pPr>
+              <w:pStyle w:val="ListParagraph"/>
+              <w:numPr>
+                <w:ilvl w:val="0"/>
+                <w:numId w:val="1"/>
+              </w:numPr>
+              <w:rPr>
+                <w:color w:val="92D050"/>
+              </w:rPr>
+            </w:pPr>
+            <w:r>
+              <w:rPr>
+                <w:color w:val="92D050"/>
+              </w:rPr>
+              <w:t xml:space="preserve">Basic </w:t>
+            </w:r>
+            <w:proofErr w:type="spellStart"/>
+            <w:r>
+              <w:rPr>
+                <w:color w:val="92D050"/>
+              </w:rPr>
+              <w:t>ui</w:t>
+            </w:r>
+            <w:proofErr w:type="spellEnd"/>
+            <w:r>
+              <w:rPr>
+                <w:color w:val="92D050"/>
+              </w:rPr>
+              <w:t xml:space="preserve"> for all pages (including frontend)</w:t>
+            </w:r>
+          </w:p>
+          <w:p>
+            <w:pPr>
+              <w:pStyle w:val="ListParagraph"/>
+              <w:numPr>
+                <w:ilvl w:val="0"/>
+                <w:numId w:val="1"/>
+              </w:numPr>
+              <w:rPr>
+                <w:color w:val="92D050"/>
+              </w:rPr>
+            </w:pPr>
+            <w:r>
+              <w:rPr>
+                <w:color w:val="92D050"/>
+              </w:rPr>
+              <w:t xml:space="preserve">Butterfly character </w:t>
             </w:r>
           </w:p>
           <w:p>
@@ -68,43 +209,7 @@
               </w:numPr>
             </w:pPr>
             <w:r>
-              <w:t xml:space="preserve">Butterfly mascot </w:t>
-            </w:r>
-          </w:p>
-          <w:p>
-            <w:pPr>
-              <w:pStyle w:val="ListParagraph"/>
-              <w:numPr>
-                <w:ilvl w:val="0"/>
-                <w:numId w:val="2"/>
-              </w:numPr>
-            </w:pPr>
-            <w:r>
-              <w:t xml:space="preserve">Butterfly character at item listing page – click buy and flying around – not too invasive </w:t>
-            </w:r>
-          </w:p>
-          <w:p>
-            <w:pPr>
-              <w:pStyle w:val="ListParagraph"/>
-              <w:numPr>
-                <w:ilvl w:val="0"/>
-                <w:numId w:val="2"/>
-              </w:numPr>
-            </w:pPr>
-            <w:r>
-              <w:t xml:space="preserve">Log-in page interaction </w:t>
-            </w:r>
-          </w:p>
-          <w:p>
-            <w:pPr>
-              <w:pStyle w:val="ListParagraph"/>
-              <w:numPr>
-                <w:ilvl w:val="0"/>
-                <w:numId w:val="5"/>
-              </w:numPr>
-            </w:pPr>
-            <w:r>
-              <w:t xml:space="preserve">Pop-up when something is achieved </w:t>
+              <w:t xml:space="preserve">Get ready for what to test </w:t>
             </w:r>
           </w:p>
         </w:tc>
@@ -116,12 +221,22 @@
           </w:tcPr>
           <w:p>
             <w:r>
-              <w:t>Week 14</w:t>
-            </w:r>
-          </w:p>
-          <w:p>
-            <w:r>
-              <w:t>28 Jan</w:t>
+              <w:t>Week 15 – 17</w:t>
+            </w:r>
+          </w:p>
+          <w:p>
+            <w:r>
+              <w:t>19 Feb</w:t>
+            </w:r>
+          </w:p>
+          <w:p>
+            <w:r>
+              <w:t xml:space="preserve">S2 Manager: </w:t>
+            </w:r>
+          </w:p>
+          <w:p>
+            <w:r>
+              <w:t xml:space="preserve">Euan </w:t>
             </w:r>
           </w:p>
         </w:tc>
@@ -131,7 +246,7 @@
           </w:tcPr>
           <w:p>
             <w:r>
-              <w:t xml:space="preserve">MVP release &amp; testing day </w:t>
+              <w:t xml:space="preserve">Beta release  </w:t>
             </w:r>
           </w:p>
           <w:p>
@@ -139,19 +254,14 @@
               <w:pStyle w:val="ListParagraph"/>
               <w:numPr>
                 <w:ilvl w:val="0"/>
-                <w:numId w:val="1"/>
+                <w:numId w:val="3"/>
               </w:numPr>
             </w:pPr>
             <w:r>
-              <w:t xml:space="preserve">Basic </w:t>
-            </w:r>
-            <w:proofErr w:type="spellStart"/>
-            <w:r>
-              <w:t>ui</w:t>
-            </w:r>
-            <w:proofErr w:type="spellEnd"/>
-            <w:r>
-              <w:t xml:space="preserve"> for all pages (including frontend)</w:t>
+              <w:t xml:space="preserve">Swiping feature </w:t>
+            </w:r>
+            <w:r>
+              <w:t>fully done</w:t>
             </w:r>
           </w:p>
           <w:p>
@@ -159,11 +269,11 @@
               <w:pStyle w:val="ListParagraph"/>
               <w:numPr>
                 <w:ilvl w:val="0"/>
-                <w:numId w:val="1"/>
+                <w:numId w:val="3"/>
               </w:numPr>
             </w:pPr>
             <w:r>
-              <w:t xml:space="preserve">Butterfly character </w:t>
+              <w:t>Log in page with backend auth</w:t>
             </w:r>
           </w:p>
           <w:p>
@@ -171,11 +281,74 @@
               <w:pStyle w:val="ListParagraph"/>
               <w:numPr>
                 <w:ilvl w:val="0"/>
-                <w:numId w:val="2"/>
+                <w:numId w:val="3"/>
               </w:numPr>
             </w:pPr>
             <w:r>
-              <w:t xml:space="preserve">Get ready for what to test </w:t>
+              <w:t xml:space="preserve">Connecting frontend and backend </w:t>
+            </w:r>
+          </w:p>
+          <w:p>
+            <w:pPr>
+              <w:pStyle w:val="ListParagraph"/>
+              <w:numPr>
+                <w:ilvl w:val="0"/>
+                <w:numId w:val="3"/>
+              </w:numPr>
+            </w:pPr>
+            <w:r>
+              <w:t>Simplify design and maintain functionality</w:t>
+            </w:r>
+            <w:r>
+              <w:t xml:space="preserve"> (frontend) </w:t>
+            </w:r>
+          </w:p>
+          <w:p>
+            <w:pPr>
+              <w:pStyle w:val="ListParagraph"/>
+              <w:numPr>
+                <w:ilvl w:val="0"/>
+                <w:numId w:val="3"/>
+              </w:numPr>
+            </w:pPr>
+            <w:r>
+              <w:t xml:space="preserve">Liked items List page </w:t>
+            </w:r>
+          </w:p>
+          <w:p>
+            <w:pPr>
+              <w:pStyle w:val="ListParagraph"/>
+              <w:numPr>
+                <w:ilvl w:val="0"/>
+                <w:numId w:val="3"/>
+              </w:numPr>
+            </w:pPr>
+            <w:r>
+              <w:t xml:space="preserve">Dev and User instruction </w:t>
+            </w:r>
+          </w:p>
+          <w:p>
+            <w:pPr>
+              <w:pStyle w:val="ListParagraph"/>
+              <w:numPr>
+                <w:ilvl w:val="0"/>
+                <w:numId w:val="3"/>
+              </w:numPr>
+            </w:pPr>
+            <w:r>
+              <w:t xml:space="preserve">Project structure </w:t>
+            </w:r>
+          </w:p>
+          <w:p>
+            <w:pPr>
+              <w:pStyle w:val="ListParagraph"/>
+              <w:numPr>
+                <w:ilvl w:val="0"/>
+                <w:numId w:val="3"/>
+              </w:numPr>
+            </w:pPr>
+            <w:r>
+              <w:t xml:space="preserve">AI Tools folder </w:t>
             </w:r>
           </w:p>
         </w:tc>
@@ -187,12 +360,20 @@
           </w:tcPr>
           <w:p>
             <w:r>
-              <w:t>Week 15 – 17</w:t>
-            </w:r>
-          </w:p>
-          <w:p>
-            <w:r>
-              <w:t>19 Feb</w:t>
+              <w:t>Week 18 – 19</w:t>
+            </w:r>
+          </w:p>
+          <w:p>
+            <w:r>
+              <w:t>6 Mar</w:t>
+            </w:r>
+            <w:r>
+              <w:t xml:space="preserve"> </w:t>
+            </w:r>
+          </w:p>
+          <w:p>
+            <w:r>
+              <w:t xml:space="preserve">S3 Manager: </w:t>
             </w:r>
           </w:p>
         </w:tc>
@@ -202,15 +383,7 @@
           </w:tcPr>
           <w:p>
             <w:r>
-              <w:t xml:space="preserve">Beta release (for others) – check w </w:t>
-            </w:r>
-            <w:proofErr w:type="spellStart"/>
-            <w:r>
-              <w:t>sarah</w:t>
-            </w:r>
-            <w:proofErr w:type="spellEnd"/>
-            <w:r>
-              <w:t xml:space="preserve"> </w:t>
+              <w:t>Beta VIVA</w:t>
             </w:r>
           </w:p>
           <w:p>
@@ -222,32 +395,7 @@
               </w:numPr>
             </w:pPr>
             <w:r>
-              <w:t xml:space="preserve">Swiping feature </w:t>
-            </w:r>
-          </w:p>
-          <w:p>
-            <w:pPr>
-              <w:pStyle w:val="ListParagraph"/>
-              <w:numPr>
-                <w:ilvl w:val="0"/>
-                <w:numId w:val="1"/>
-              </w:numPr>
-            </w:pPr>
-            <w:r>
-              <w:t xml:space="preserve">Think about how it should be in more depth </w:t>
-            </w:r>
-          </w:p>
-          <w:p>
-            <w:pPr>
-              <w:pStyle w:val="ListParagraph"/>
-              <w:numPr>
-                <w:ilvl w:val="0"/>
-                <w:numId w:val="1"/>
-              </w:numPr>
-              <w:spacing w:after="160" w:line="278" w:lineRule="auto"/>
-            </w:pPr>
-            <w:r>
-              <w:t xml:space="preserve">Connecting frontend and backend </w:t>
+              <w:t xml:space="preserve">Slides </w:t>
             </w:r>
           </w:p>
         </w:tc>
@@ -259,51 +407,17 @@
           </w:tcPr>
           <w:p>
             <w:r>
-              <w:t>Week 18 – 19</w:t>
-            </w:r>
-          </w:p>
-          <w:p>
-            <w:r>
-              <w:t>6 Mar</w:t>
-            </w:r>
-          </w:p>
-        </w:tc>
-        <w:tc>
-          <w:tcPr>
-            <w:tcW w:w="7401" w:type="dxa"/>
-          </w:tcPr>
-          <w:p>
-            <w:r>
-              <w:t>Beta VIVA</w:t>
-            </w:r>
-          </w:p>
-          <w:p>
-            <w:pPr>
-              <w:pStyle w:val="ListParagraph"/>
-              <w:numPr>
-                <w:ilvl w:val="0"/>
-                <w:numId w:val="3"/>
-              </w:numPr>
-            </w:pPr>
-            <w:r>
-              <w:t xml:space="preserve">Slides </w:t>
-            </w:r>
-          </w:p>
-        </w:tc>
-      </w:tr>
-      <w:tr>
-        <w:tc>
-          <w:tcPr>
-            <w:tcW w:w="1615" w:type="dxa"/>
-          </w:tcPr>
-          <w:p>
-            <w:r>
               <w:t>Week 20 – 21</w:t>
             </w:r>
           </w:p>
           <w:p>
             <w:r>
               <w:t>20 Mar</w:t>
+            </w:r>
+          </w:p>
+          <w:p>
+            <w:r>
+              <w:t xml:space="preserve">S4 Manager: </w:t>
             </w:r>
           </w:p>
         </w:tc>
@@ -353,6 +467,11 @@
           <w:p>
             <w:r>
               <w:t>30 Apr</w:t>
+            </w:r>
+          </w:p>
+          <w:p>
+            <w:r>
+              <w:t xml:space="preserve">S5 Manager: </w:t>
             </w:r>
           </w:p>
         </w:tc>
@@ -429,7 +548,66 @@
       </w:tr>
     </w:tbl>
     <w:p/>
-    <w:p/>
+    <w:p>
+      <w:pPr>
+        <w:pStyle w:val="ListParagraph"/>
+        <w:numPr>
+          <w:ilvl w:val="0"/>
+          <w:numId w:val="6"/>
+        </w:numPr>
+      </w:pPr>
+      <w:r>
+        <w:rPr>
+          <w:color w:val="00B050"/>
+        </w:rPr>
+        <w:t xml:space="preserve">Green </w:t>
+      </w:r>
+      <w:r>
+        <w:t xml:space="preserve">= achieved </w:t>
+      </w:r>
+    </w:p>
+    <w:p>
+      <w:pPr>
+        <w:pStyle w:val="ListParagraph"/>
+        <w:numPr>
+          <w:ilvl w:val="0"/>
+          <w:numId w:val="6"/>
+        </w:numPr>
+      </w:pPr>
+      <w:r>
+        <w:rPr>
+          <w:color w:val="C00000"/>
+        </w:rPr>
+        <w:t xml:space="preserve">Red </w:t>
+      </w:r>
+      <w:r>
+        <w:t>= not achieved / postponed</w:t>
+      </w:r>
+    </w:p>
+    <w:p>
+      <w:pPr>
+        <w:pStyle w:val="ListParagraph"/>
+        <w:numPr>
+          <w:ilvl w:val="0"/>
+          <w:numId w:val="6"/>
+        </w:numPr>
+      </w:pPr>
+      <w:r>
+        <w:rPr>
+          <w:color w:val="95DCF7" w:themeColor="accent4" w:themeTint="66"/>
+        </w:rPr>
+        <w:t>Blue</w:t>
+      </w:r>
+      <w:r>
+        <w:rPr>
+          <w:color w:val="95DCF7" w:themeColor="accent4" w:themeTint="66"/>
+        </w:rPr>
+        <w:t xml:space="preserve"> </w:t>
+      </w:r>
+      <w:r>
+        <w:t xml:space="preserve">= partial achieved </w:t>
+      </w:r>
+    </w:p>
     <w:sectPr>
       <w:pgSz w:w="11906" w:h="16838"/>
       <w:pgMar w:top="1440" w:right="1440" w:bottom="1440" w:left="1440" w:header="708" w:footer="708" w:gutter="0"/>
@@ -608,7 +786,7 @@
   <w:abstractNum w:abstractNumId="1" w15:restartNumberingAfterBreak="0">
     <w:nsid w:val="2D8F7E64"/>
     <w:multiLevelType w:val="hybridMultilevel"/>
-    <w:tmpl w:val="3AD46902"/>
+    <w:tmpl w:val="248EB756"/>
     <w:lvl w:ilvl="0" w:tplc="48090001">
       <w:start w:val="1"/>
       <w:numFmt w:val="bullet"/>
@@ -721,7 +899,7 @@
   <w:abstractNum w:abstractNumId="2" w15:restartNumberingAfterBreak="0">
     <w:nsid w:val="2FEE0B85"/>
     <w:multiLevelType w:val="hybridMultilevel"/>
-    <w:tmpl w:val="3D680CC0"/>
+    <w:tmpl w:val="F4AE4BF4"/>
     <w:lvl w:ilvl="0" w:tplc="48090001">
       <w:start w:val="1"/>
       <w:numFmt w:val="bullet"/>
@@ -2470,6 +2648,23 @@
 </file>
 
 <file path=customXml/item1.xml><?xml version="1.0" encoding="utf-8"?>
+<p:properties xmlns:p="http://schemas.microsoft.com/office/2006/metadata/properties" xmlns:xsi="http://www.w3.org/2001/XMLSchema-instance" xmlns:pc="http://schemas.microsoft.com/office/infopath/2007/PartnerControls">
+  <documentManagement>
+    <_activity xmlns="c1fde8e6-15e9-4f57-b0de-d5c723ae8024" xsi:nil="true"/>
+  </documentManagement>
+</p:properties>
+</file>
+
+<file path=customXml/item2.xml><?xml version="1.0" encoding="utf-8"?>
+<?mso-contentType ?>
+<FormTemplates xmlns="http://schemas.microsoft.com/sharepoint/v3/contenttype/forms">
+  <Display>DocumentLibraryForm</Display>
+  <Edit>DocumentLibraryForm</Edit>
+  <New>DocumentLibraryForm</New>
+</FormTemplates>
+</file>
+
+<file path=customXml/item3.xml><?xml version="1.0" encoding="utf-8"?>
 <ct:contentTypeSchema xmlns:ct="http://schemas.microsoft.com/office/2006/metadata/contentType" xmlns:ma="http://schemas.microsoft.com/office/2006/metadata/properties/metaAttributes" ct:_="" ma:_="" ma:contentTypeName="Document" ma:contentTypeID="0x01010005B609B1048A5941BB6E67A4E722FE67" ma:contentTypeVersion="10" ma:contentTypeDescription="Create a new document." ma:contentTypeScope="" ma:versionID="109a0aed9acbb85e93353a131228a513">
   <xsd:schema xmlns:xsd="http://www.w3.org/2001/XMLSchema" xmlns:xs="http://www.w3.org/2001/XMLSchema" xmlns:p="http://schemas.microsoft.com/office/2006/metadata/properties" xmlns:ns3="c1fde8e6-15e9-4f57-b0de-d5c723ae8024" targetNamespace="http://schemas.microsoft.com/office/2006/metadata/properties" ma:root="true" ma:fieldsID="51338ab0da76a4a51cefc45a05951134" ns3:_="">
     <xsd:import namespace="c1fde8e6-15e9-4f57-b0de-d5c723ae8024"/>
@@ -2649,24 +2844,29 @@
 </ct:contentTypeSchema>
 </file>
 
-<file path=customXml/item2.xml><?xml version="1.0" encoding="utf-8"?>
-<?mso-contentType ?>
-<FormTemplates xmlns="http://schemas.microsoft.com/sharepoint/v3/contenttype/forms">
-  <Display>DocumentLibraryForm</Display>
-  <Edit>DocumentLibraryForm</Edit>
-  <New>DocumentLibraryForm</New>
-</FormTemplates>
-</file>
-
-<file path=customXml/item3.xml><?xml version="1.0" encoding="utf-8"?>
-<p:properties xmlns:p="http://schemas.microsoft.com/office/2006/metadata/properties" xmlns:xsi="http://www.w3.org/2001/XMLSchema-instance" xmlns:pc="http://schemas.microsoft.com/office/infopath/2007/PartnerControls">
-  <documentManagement>
-    <_activity xmlns="c1fde8e6-15e9-4f57-b0de-d5c723ae8024" xsi:nil="true"/>
-  </documentManagement>
-</p:properties>
+<file path=customXml/item4.xml><?xml version="1.0" encoding="utf-8"?>
+<b:Sources xmlns:b="http://schemas.openxmlformats.org/officeDocument/2006/bibliography" xmlns="http://schemas.openxmlformats.org/officeDocument/2006/bibliography" SelectedStyle="\APASixthEditionOfficeOnline.xsl" StyleName="APA" Version="6"/>
 </file>
 
 <file path=customXml/itemProps1.xml><?xml version="1.0" encoding="utf-8"?>
+<ds:datastoreItem xmlns:ds="http://schemas.openxmlformats.org/officeDocument/2006/customXml" ds:itemID="{851DE5CA-511E-4D7B-9080-ADE36A75AD57}">
+  <ds:schemaRefs>
+    <ds:schemaRef ds:uri="http://schemas.microsoft.com/office/2006/metadata/properties"/>
+    <ds:schemaRef ds:uri="http://schemas.microsoft.com/office/infopath/2007/PartnerControls"/>
+    <ds:schemaRef ds:uri="c1fde8e6-15e9-4f57-b0de-d5c723ae8024"/>
+  </ds:schemaRefs>
+</ds:datastoreItem>
+</file>
+
+<file path=customXml/itemProps2.xml><?xml version="1.0" encoding="utf-8"?>
+<ds:datastoreItem xmlns:ds="http://schemas.openxmlformats.org/officeDocument/2006/customXml" ds:itemID="{C0812FE0-0483-4A30-9AE8-465FBF0BE913}">
+  <ds:schemaRefs>
+    <ds:schemaRef ds:uri="http://schemas.microsoft.com/sharepoint/v3/contenttype/forms"/>
+  </ds:schemaRefs>
+</ds:datastoreItem>
+</file>
+
+<file path=customXml/itemProps3.xml><?xml version="1.0" encoding="utf-8"?>
 <ds:datastoreItem xmlns:ds="http://schemas.openxmlformats.org/officeDocument/2006/customXml" ds:itemID="{83BEFAFF-9ABD-4471-BAC7-576AC3101962}">
   <ds:schemaRefs>
     <ds:schemaRef ds:uri="http://schemas.microsoft.com/office/2006/metadata/contentType"/>
@@ -2684,20 +2884,10 @@
 </ds:datastoreItem>
 </file>
 
-<file path=customXml/itemProps2.xml><?xml version="1.0" encoding="utf-8"?>
-<ds:datastoreItem xmlns:ds="http://schemas.openxmlformats.org/officeDocument/2006/customXml" ds:itemID="{C0812FE0-0483-4A30-9AE8-465FBF0BE913}">
+<file path=customXml/itemProps4.xml><?xml version="1.0" encoding="utf-8"?>
+<ds:datastoreItem xmlns:ds="http://schemas.openxmlformats.org/officeDocument/2006/customXml" ds:itemID="{BAA6DC73-46D5-4F56-95FD-410277D77F40}">
   <ds:schemaRefs>
-    <ds:schemaRef ds:uri="http://schemas.microsoft.com/sharepoint/v3/contenttype/forms"/>
-  </ds:schemaRefs>
-</ds:datastoreItem>
-</file>
-
-<file path=customXml/itemProps3.xml><?xml version="1.0" encoding="utf-8"?>
-<ds:datastoreItem xmlns:ds="http://schemas.openxmlformats.org/officeDocument/2006/customXml" ds:itemID="{851DE5CA-511E-4D7B-9080-ADE36A75AD57}">
-  <ds:schemaRefs>
-    <ds:schemaRef ds:uri="http://schemas.microsoft.com/office/2006/metadata/properties"/>
-    <ds:schemaRef ds:uri="http://schemas.microsoft.com/office/infopath/2007/PartnerControls"/>
-    <ds:schemaRef ds:uri="c1fde8e6-15e9-4f57-b0de-d5c723ae8024"/>
+    <ds:schemaRef ds:uri="http://schemas.openxmlformats.org/officeDocument/2006/bibliography"/>
   </ds:schemaRefs>
 </ds:datastoreItem>
 </file>
</xml_diff>